<commit_message>
alterações no mr, requisitos e no script
</commit_message>
<xml_diff>
--- a/Requisitos.docx
+++ b/Requisitos.docx
@@ -755,7 +755,7 @@
           <w:szCs w:val="24"/>
           <w:rtl w:val="0"/>
         </w:rPr>
-        <w:t xml:space="preserve"> Exclusão lógica de produtos (marcando como inativo, para preservar o histórico).</w:t>
+        <w:t xml:space="preserve"> Exclusão de produtos, ativo ou inativo</w:t>
       </w:r>
     </w:p>
     <w:p>
@@ -1089,7 +1089,7 @@
           <w:szCs w:val="24"/>
           <w:rtl w:val="0"/>
         </w:rPr>
-        <w:t xml:space="preserve"> O sistema deve implementar controle de acesso com login e senha, com permissões diferentes por cargo (exemplo: vendedor, gerente).</w:t>
+        <w:t xml:space="preserve"> O sistema deve implementar controle de acesso com login e senha para funcionários</w:t>
       </w:r>
     </w:p>
     <w:p>
@@ -1417,122 +1417,6 @@
           <w:szCs w:val="24"/>
           <w:rtl w:val="0"/>
         </w:rPr>
-        <w:t xml:space="preserve"> Permitir o parcelamento das vendas, com definição de número de parcelas e valores.</w:t>
-      </w:r>
-    </w:p>
-    <w:p>
-      <w:pPr>
-        <w:widowControl w:val="0"/>
-        <w:pBdr>
-          <w:top w:space="0" w:sz="0" w:val="nil"/>
-          <w:left w:space="0" w:sz="0" w:val="nil"/>
-          <w:bottom w:space="0" w:sz="0" w:val="nil"/>
-          <w:right w:space="0" w:sz="0" w:val="nil"/>
-          <w:between w:space="0" w:sz="0" w:val="nil"/>
-        </w:pBdr>
-        <w:shd w:fill="auto" w:val="clear"/>
-        <w:spacing w:line="240" w:lineRule="auto"/>
-        <w:rPr>
-          <w:sz w:val="24"/>
-          <w:szCs w:val="24"/>
-        </w:rPr>
-      </w:pPr>
-      <w:r>
-        <w:rPr>
-          <w:rtl w:val="0"/>
-        </w:rPr>
-      </w:r>
-    </w:p>
-    <w:p>
-      <w:pPr>
-        <w:widowControl w:val="0"/>
-        <w:pBdr>
-          <w:top w:space="0" w:sz="0" w:val="nil"/>
-          <w:left w:space="0" w:sz="0" w:val="nil"/>
-          <w:bottom w:space="0" w:sz="0" w:val="nil"/>
-          <w:right w:space="0" w:sz="0" w:val="nil"/>
-          <w:between w:space="0" w:sz="0" w:val="nil"/>
-        </w:pBdr>
-        <w:shd w:fill="auto" w:val="clear"/>
-        <w:spacing w:line="240" w:lineRule="auto"/>
-        <w:rPr>
-          <w:sz w:val="24"/>
-          <w:szCs w:val="24"/>
-        </w:rPr>
-      </w:pPr>
-      <w:r>
-        <w:rPr>
-          <w:b w:val="1"/>
-          <w:sz w:val="24"/>
-          <w:szCs w:val="24"/>
-          <w:rtl w:val="0"/>
-        </w:rPr>
-        <w:t xml:space="preserve">RF13:</w:t>
-      </w:r>
-      <w:r>
-        <w:rPr>
-          <w:sz w:val="24"/>
-          <w:szCs w:val="24"/>
-          <w:rtl w:val="0"/>
-        </w:rPr>
-        <w:t xml:space="preserve"> Geração automática de comprovante ou recibo da venda.</w:t>
-      </w:r>
-    </w:p>
-    <w:p>
-      <w:pPr>
-        <w:widowControl w:val="0"/>
-        <w:pBdr>
-          <w:top w:space="0" w:sz="0" w:val="nil"/>
-          <w:left w:space="0" w:sz="0" w:val="nil"/>
-          <w:bottom w:space="0" w:sz="0" w:val="nil"/>
-          <w:right w:space="0" w:sz="0" w:val="nil"/>
-          <w:between w:space="0" w:sz="0" w:val="nil"/>
-        </w:pBdr>
-        <w:shd w:fill="auto" w:val="clear"/>
-        <w:spacing w:line="240" w:lineRule="auto"/>
-        <w:rPr>
-          <w:sz w:val="24"/>
-          <w:szCs w:val="24"/>
-        </w:rPr>
-      </w:pPr>
-      <w:r>
-        <w:rPr>
-          <w:rtl w:val="0"/>
-        </w:rPr>
-      </w:r>
-    </w:p>
-    <w:p>
-      <w:pPr>
-        <w:widowControl w:val="0"/>
-        <w:pBdr>
-          <w:top w:space="0" w:sz="0" w:val="nil"/>
-          <w:left w:space="0" w:sz="0" w:val="nil"/>
-          <w:bottom w:space="0" w:sz="0" w:val="nil"/>
-          <w:right w:space="0" w:sz="0" w:val="nil"/>
-          <w:between w:space="0" w:sz="0" w:val="nil"/>
-        </w:pBdr>
-        <w:shd w:fill="auto" w:val="clear"/>
-        <w:spacing w:line="240" w:lineRule="auto"/>
-        <w:rPr>
-          <w:sz w:val="24"/>
-          <w:szCs w:val="24"/>
-        </w:rPr>
-      </w:pPr>
-      <w:r>
-        <w:rPr>
-          <w:b w:val="1"/>
-          <w:sz w:val="24"/>
-          <w:szCs w:val="24"/>
-          <w:rtl w:val="0"/>
-        </w:rPr>
-        <w:t xml:space="preserve">RF14:</w:t>
-      </w:r>
-      <w:r>
-        <w:rPr>
-          <w:sz w:val="24"/>
-          <w:szCs w:val="24"/>
-          <w:rtl w:val="0"/>
-        </w:rPr>
         <w:t xml:space="preserve"> Controle de baixa automática do estoque após a finalização de uma venda.</w:t>
       </w:r>
     </w:p>
@@ -1604,139 +1488,139 @@
           <w:szCs w:val="24"/>
           <w:rtl w:val="0"/>
         </w:rPr>
+        <w:t xml:space="preserve">RF13:</w:t>
+      </w:r>
+      <w:r>
+        <w:rPr>
+          <w:sz w:val="24"/>
+          <w:szCs w:val="24"/>
+          <w:rtl w:val="0"/>
+        </w:rPr>
+        <w:t xml:space="preserve"> Registro de vendas no formato condicional, com data de retirada e data prevista de devolução.</w:t>
+      </w:r>
+    </w:p>
+    <w:p>
+      <w:pPr>
+        <w:widowControl w:val="0"/>
+        <w:pBdr>
+          <w:top w:space="0" w:sz="0" w:val="nil"/>
+          <w:left w:space="0" w:sz="0" w:val="nil"/>
+          <w:bottom w:space="0" w:sz="0" w:val="nil"/>
+          <w:right w:space="0" w:sz="0" w:val="nil"/>
+          <w:between w:space="0" w:sz="0" w:val="nil"/>
+        </w:pBdr>
+        <w:shd w:fill="auto" w:val="clear"/>
+        <w:spacing w:line="240" w:lineRule="auto"/>
+        <w:rPr>
+          <w:sz w:val="24"/>
+          <w:szCs w:val="24"/>
+        </w:rPr>
+      </w:pPr>
+      <w:r>
+        <w:rPr>
+          <w:rtl w:val="0"/>
+        </w:rPr>
+      </w:r>
+    </w:p>
+    <w:p>
+      <w:pPr>
+        <w:widowControl w:val="0"/>
+        <w:pBdr>
+          <w:top w:space="0" w:sz="0" w:val="nil"/>
+          <w:left w:space="0" w:sz="0" w:val="nil"/>
+          <w:bottom w:space="0" w:sz="0" w:val="nil"/>
+          <w:right w:space="0" w:sz="0" w:val="nil"/>
+          <w:between w:space="0" w:sz="0" w:val="nil"/>
+        </w:pBdr>
+        <w:shd w:fill="auto" w:val="clear"/>
+        <w:spacing w:line="240" w:lineRule="auto"/>
+        <w:rPr>
+          <w:sz w:val="24"/>
+          <w:szCs w:val="24"/>
+        </w:rPr>
+      </w:pPr>
+      <w:r>
+        <w:rPr>
+          <w:b w:val="1"/>
+          <w:sz w:val="24"/>
+          <w:szCs w:val="24"/>
+          <w:rtl w:val="0"/>
+        </w:rPr>
+        <w:t xml:space="preserve">RF14:</w:t>
+      </w:r>
+      <w:r>
+        <w:rPr>
+          <w:sz w:val="24"/>
+          <w:szCs w:val="24"/>
+          <w:rtl w:val="0"/>
+        </w:rPr>
+        <w:t xml:space="preserve"> Finalização de uma condicional, permitindo que o cliente devolva as peças ou conclua a compra dos itens levados.</w:t>
+      </w:r>
+    </w:p>
+    <w:p>
+      <w:pPr>
+        <w:widowControl w:val="0"/>
+        <w:pBdr>
+          <w:top w:space="0" w:sz="0" w:val="nil"/>
+          <w:left w:space="0" w:sz="0" w:val="nil"/>
+          <w:bottom w:space="0" w:sz="0" w:val="nil"/>
+          <w:right w:space="0" w:sz="0" w:val="nil"/>
+          <w:between w:space="0" w:sz="0" w:val="nil"/>
+        </w:pBdr>
+        <w:shd w:fill="auto" w:val="clear"/>
+        <w:spacing w:line="240" w:lineRule="auto"/>
+        <w:rPr>
+          <w:sz w:val="24"/>
+          <w:szCs w:val="24"/>
+        </w:rPr>
+      </w:pPr>
+      <w:r>
+        <w:rPr>
+          <w:rtl w:val="0"/>
+        </w:rPr>
+      </w:r>
+    </w:p>
+    <w:p>
+      <w:pPr>
+        <w:spacing w:line="360" w:lineRule="auto"/>
+        <w:jc w:val="both"/>
+        <w:rPr>
+          <w:sz w:val="24"/>
+          <w:szCs w:val="24"/>
+        </w:rPr>
+      </w:pPr>
+      <w:r>
+        <w:rPr>
+          <w:b w:val="1"/>
+          <w:sz w:val="28"/>
+          <w:szCs w:val="28"/>
+          <w:rtl w:val="0"/>
+        </w:rPr>
+        <w:t xml:space="preserve">Loja</w:t>
+      </w:r>
+      <w:r>
+        <w:rPr>
+          <w:rtl w:val="0"/>
+        </w:rPr>
+      </w:r>
+    </w:p>
+    <w:p>
+      <w:pPr>
+        <w:spacing w:line="360" w:lineRule="auto"/>
+        <w:jc w:val="both"/>
+        <w:rPr>
+          <w:sz w:val="24"/>
+          <w:szCs w:val="24"/>
+        </w:rPr>
+      </w:pPr>
+      <w:r>
+        <w:rPr>
+          <w:b w:val="1"/>
+          <w:sz w:val="24"/>
+          <w:szCs w:val="24"/>
+          <w:rtl w:val="0"/>
+        </w:rPr>
         <w:t xml:space="preserve">RF15:</w:t>
-      </w:r>
-      <w:r>
-        <w:rPr>
-          <w:sz w:val="24"/>
-          <w:szCs w:val="24"/>
-          <w:rtl w:val="0"/>
-        </w:rPr>
-        <w:t xml:space="preserve"> Registro de vendas no formato condicional, com data de retirada e data prevista de devolução.</w:t>
-      </w:r>
-    </w:p>
-    <w:p>
-      <w:pPr>
-        <w:widowControl w:val="0"/>
-        <w:pBdr>
-          <w:top w:space="0" w:sz="0" w:val="nil"/>
-          <w:left w:space="0" w:sz="0" w:val="nil"/>
-          <w:bottom w:space="0" w:sz="0" w:val="nil"/>
-          <w:right w:space="0" w:sz="0" w:val="nil"/>
-          <w:between w:space="0" w:sz="0" w:val="nil"/>
-        </w:pBdr>
-        <w:shd w:fill="auto" w:val="clear"/>
-        <w:spacing w:line="240" w:lineRule="auto"/>
-        <w:rPr>
-          <w:sz w:val="24"/>
-          <w:szCs w:val="24"/>
-        </w:rPr>
-      </w:pPr>
-      <w:r>
-        <w:rPr>
-          <w:rtl w:val="0"/>
-        </w:rPr>
-      </w:r>
-    </w:p>
-    <w:p>
-      <w:pPr>
-        <w:widowControl w:val="0"/>
-        <w:pBdr>
-          <w:top w:space="0" w:sz="0" w:val="nil"/>
-          <w:left w:space="0" w:sz="0" w:val="nil"/>
-          <w:bottom w:space="0" w:sz="0" w:val="nil"/>
-          <w:right w:space="0" w:sz="0" w:val="nil"/>
-          <w:between w:space="0" w:sz="0" w:val="nil"/>
-        </w:pBdr>
-        <w:shd w:fill="auto" w:val="clear"/>
-        <w:spacing w:line="240" w:lineRule="auto"/>
-        <w:rPr>
-          <w:sz w:val="24"/>
-          <w:szCs w:val="24"/>
-        </w:rPr>
-      </w:pPr>
-      <w:r>
-        <w:rPr>
-          <w:b w:val="1"/>
-          <w:sz w:val="24"/>
-          <w:szCs w:val="24"/>
-          <w:rtl w:val="0"/>
-        </w:rPr>
-        <w:t xml:space="preserve">RF17:</w:t>
-      </w:r>
-      <w:r>
-        <w:rPr>
-          <w:sz w:val="24"/>
-          <w:szCs w:val="24"/>
-          <w:rtl w:val="0"/>
-        </w:rPr>
-        <w:t xml:space="preserve"> Finalização de uma condicional, permitindo que o cliente devolva as peças ou conclua a compra dos itens levados.</w:t>
-      </w:r>
-    </w:p>
-    <w:p>
-      <w:pPr>
-        <w:widowControl w:val="0"/>
-        <w:pBdr>
-          <w:top w:space="0" w:sz="0" w:val="nil"/>
-          <w:left w:space="0" w:sz="0" w:val="nil"/>
-          <w:bottom w:space="0" w:sz="0" w:val="nil"/>
-          <w:right w:space="0" w:sz="0" w:val="nil"/>
-          <w:between w:space="0" w:sz="0" w:val="nil"/>
-        </w:pBdr>
-        <w:shd w:fill="auto" w:val="clear"/>
-        <w:spacing w:line="240" w:lineRule="auto"/>
-        <w:rPr>
-          <w:sz w:val="24"/>
-          <w:szCs w:val="24"/>
-        </w:rPr>
-      </w:pPr>
-      <w:r>
-        <w:rPr>
-          <w:rtl w:val="0"/>
-        </w:rPr>
-      </w:r>
-    </w:p>
-    <w:p>
-      <w:pPr>
-        <w:spacing w:line="360" w:lineRule="auto"/>
-        <w:jc w:val="both"/>
-        <w:rPr>
-          <w:sz w:val="24"/>
-          <w:szCs w:val="24"/>
-        </w:rPr>
-      </w:pPr>
-      <w:r>
-        <w:rPr>
-          <w:b w:val="1"/>
-          <w:sz w:val="28"/>
-          <w:szCs w:val="28"/>
-          <w:rtl w:val="0"/>
-        </w:rPr>
-        <w:t xml:space="preserve">Loja</w:t>
-      </w:r>
-      <w:r>
-        <w:rPr>
-          <w:rtl w:val="0"/>
-        </w:rPr>
-      </w:r>
-    </w:p>
-    <w:p>
-      <w:pPr>
-        <w:spacing w:line="360" w:lineRule="auto"/>
-        <w:jc w:val="both"/>
-        <w:rPr>
-          <w:sz w:val="24"/>
-          <w:szCs w:val="24"/>
-        </w:rPr>
-      </w:pPr>
-      <w:r>
-        <w:rPr>
-          <w:b w:val="1"/>
-          <w:sz w:val="24"/>
-          <w:szCs w:val="24"/>
-          <w:rtl w:val="0"/>
-        </w:rPr>
-        <w:t xml:space="preserve">RF18:</w:t>
       </w:r>
       <w:r>
         <w:rPr>

</xml_diff>